<commit_message>
uploading new content that hadn't been uploaded in a while
</commit_message>
<xml_diff>
--- a/business_case/assignment-template.docx
+++ b/business_case/assignment-template.docx
@@ -9,6 +9,8 @@
           <w:rFonts w:ascii="Times New Roman" w:hAnsi="Times New Roman" w:cs="Times New Roman"/>
           <w:b/>
           <w:bCs/>
+          <w:i/>
+          <w:iCs/>
         </w:rPr>
       </w:pPr>
       <w:r>
@@ -16,7 +18,8 @@
           <w:rFonts w:ascii="Times New Roman" w:hAnsi="Times New Roman" w:cs="Times New Roman"/>
           <w:b/>
           <w:bCs/>
-          <w:highlight w:val="cyan"/>
+          <w:i/>
+          <w:iCs/>
         </w:rPr>
         <w:t>Mentor Decision Memo Template</w:t>
       </w:r>
@@ -25,7 +28,8 @@
           <w:rFonts w:ascii="Times New Roman" w:hAnsi="Times New Roman" w:cs="Times New Roman"/>
           <w:b/>
           <w:bCs/>
-          <w:highlight w:val="cyan"/>
+          <w:i/>
+          <w:iCs/>
         </w:rPr>
         <w:t xml:space="preserve"> </w:t>
       </w:r>
@@ -34,7 +38,8 @@
           <w:rFonts w:ascii="Times New Roman" w:hAnsi="Times New Roman" w:cs="Times New Roman"/>
           <w:b/>
           <w:bCs/>
-          <w:highlight w:val="cyan"/>
+          <w:i/>
+          <w:iCs/>
         </w:rPr>
         <w:t>[Remove this in the final submission]</w:t>
       </w:r>
@@ -43,6 +48,8 @@
           <w:rFonts w:ascii="Times New Roman" w:hAnsi="Times New Roman" w:cs="Times New Roman"/>
           <w:b/>
           <w:bCs/>
+          <w:i/>
+          <w:iCs/>
         </w:rPr>
         <w:t xml:space="preserve"> </w:t>
       </w:r>
@@ -127,15 +134,7 @@
                 <w:b/>
                 <w:bCs/>
               </w:rPr>
-              <w:t>Mentor</w:t>
-            </w:r>
-            <w:r>
-              <w:rPr>
-                <w:rFonts w:ascii="Times New Roman" w:hAnsi="Times New Roman" w:cs="Times New Roman"/>
-                <w:b/>
-                <w:bCs/>
-              </w:rPr>
-              <w:t>:</w:t>
+              <w:t>Mentor:</w:t>
             </w:r>
           </w:p>
         </w:tc>
@@ -181,23 +180,7 @@
                 <w:b/>
                 <w:bCs/>
               </w:rPr>
-              <w:t>Company</w:t>
-            </w:r>
-            <w:r>
-              <w:rPr>
-                <w:rFonts w:ascii="Times New Roman" w:hAnsi="Times New Roman" w:cs="Times New Roman"/>
-                <w:b/>
-                <w:bCs/>
-              </w:rPr>
-              <w:t>/Organization</w:t>
-            </w:r>
-            <w:r>
-              <w:rPr>
-                <w:rFonts w:ascii="Times New Roman" w:hAnsi="Times New Roman" w:cs="Times New Roman"/>
-                <w:b/>
-                <w:bCs/>
-              </w:rPr>
-              <w:t>:</w:t>
+              <w:t>Company/Organization:</w:t>
             </w:r>
           </w:p>
         </w:tc>
@@ -244,15 +227,7 @@
                 <w:b/>
                 <w:bCs/>
               </w:rPr>
-              <w:t>Location</w:t>
-            </w:r>
-            <w:r>
-              <w:rPr>
-                <w:rFonts w:ascii="Times New Roman" w:hAnsi="Times New Roman" w:cs="Times New Roman"/>
-                <w:b/>
-                <w:bCs/>
-              </w:rPr>
-              <w:t>:</w:t>
+              <w:t>Location:</w:t>
             </w:r>
           </w:p>
         </w:tc>
@@ -402,11 +377,19 @@
           <w:rFonts w:ascii="Times New Roman" w:hAnsi="Times New Roman" w:cs="Times New Roman"/>
         </w:rPr>
       </w:pPr>
-      <w:r>
-        <w:rPr>
-          <w:rFonts w:ascii="Times New Roman" w:hAnsi="Times New Roman" w:cs="Times New Roman"/>
-        </w:rPr>
-        <w:t xml:space="preserve">Introduce the </w:t>
+      <w:proofErr w:type="gramStart"/>
+      <w:r>
+        <w:rPr>
+          <w:rFonts w:ascii="Times New Roman" w:hAnsi="Times New Roman" w:cs="Times New Roman"/>
+        </w:rPr>
+        <w:t>Introduce</w:t>
+      </w:r>
+      <w:proofErr w:type="gramEnd"/>
+      <w:r>
+        <w:rPr>
+          <w:rFonts w:ascii="Times New Roman" w:hAnsi="Times New Roman" w:cs="Times New Roman"/>
+        </w:rPr>
+        <w:t xml:space="preserve"> the </w:t>
       </w:r>
       <w:r>
         <w:rPr>
@@ -452,7 +435,21 @@
         <w:rPr>
           <w:rFonts w:ascii="Times New Roman" w:hAnsi="Times New Roman" w:cs="Times New Roman"/>
         </w:rPr>
-        <w:t>What problem or opportunity were they addressing?</w:t>
+        <w:t xml:space="preserve">What problem or opportunity were they </w:t>
+      </w:r>
+      <w:proofErr w:type="gramStart"/>
+      <w:r>
+        <w:rPr>
+          <w:rFonts w:ascii="Times New Roman" w:hAnsi="Times New Roman" w:cs="Times New Roman"/>
+        </w:rPr>
+        <w:t>addressing</w:t>
+      </w:r>
+      <w:proofErr w:type="gramEnd"/>
+      <w:r>
+        <w:rPr>
+          <w:rFonts w:ascii="Times New Roman" w:hAnsi="Times New Roman" w:cs="Times New Roman"/>
+        </w:rPr>
+        <w:t>?</w:t>
       </w:r>
     </w:p>
     <w:p>
@@ -613,7 +610,21 @@
         <w:rPr>
           <w:rFonts w:ascii="Times New Roman" w:hAnsi="Times New Roman" w:cs="Times New Roman"/>
         </w:rPr>
-        <w:t>Why is this decision important to the business’s future?</w:t>
+        <w:t xml:space="preserve">Why is this decision important to the </w:t>
+      </w:r>
+      <w:proofErr w:type="gramStart"/>
+      <w:r>
+        <w:rPr>
+          <w:rFonts w:ascii="Times New Roman" w:hAnsi="Times New Roman" w:cs="Times New Roman"/>
+        </w:rPr>
+        <w:t>business’s</w:t>
+      </w:r>
+      <w:proofErr w:type="gramEnd"/>
+      <w:r>
+        <w:rPr>
+          <w:rFonts w:ascii="Times New Roman" w:hAnsi="Times New Roman" w:cs="Times New Roman"/>
+        </w:rPr>
+        <w:t xml:space="preserve"> future?</w:t>
       </w:r>
     </w:p>
     <w:p>
@@ -659,6 +670,24 @@
           <w:b/>
           <w:bCs/>
         </w:rPr>
+        <w:br w:type="page"/>
+      </w:r>
+    </w:p>
+    <w:p>
+      <w:pPr>
+        <w:rPr>
+          <w:rFonts w:ascii="Times New Roman" w:hAnsi="Times New Roman" w:cs="Times New Roman"/>
+          <w:b/>
+          <w:bCs/>
+        </w:rPr>
+      </w:pPr>
+      <w:r>
+        <w:rPr>
+          <w:rFonts w:ascii="Times New Roman" w:hAnsi="Times New Roman" w:cs="Times New Roman"/>
+          <w:b/>
+          <w:bCs/>
+        </w:rPr>
+        <w:lastRenderedPageBreak/>
         <w:t>Considerations (½–¾ page)</w:t>
       </w:r>
     </w:p>
@@ -672,7 +701,6 @@
         <w:rPr>
           <w:rFonts w:ascii="Times New Roman" w:hAnsi="Times New Roman" w:cs="Times New Roman"/>
         </w:rPr>
-        <w:lastRenderedPageBreak/>
         <w:t>Analyze what made the decision difficult.</w:t>
       </w:r>
     </w:p>
@@ -860,7 +888,25 @@
           <w:i/>
           <w:iCs/>
         </w:rPr>
-        <w:t>Keep it short and analytical — your reader should be able to debate the possible answers in class before learning what actually happened.</w:t>
+        <w:t xml:space="preserve">Keep it short and analytical — your reader should be able to debate the possible answers in class before learning what </w:t>
+      </w:r>
+      <w:proofErr w:type="gramStart"/>
+      <w:r>
+        <w:rPr>
+          <w:rFonts w:ascii="Times New Roman" w:hAnsi="Times New Roman" w:cs="Times New Roman"/>
+          <w:i/>
+          <w:iCs/>
+        </w:rPr>
+        <w:t>actually happened</w:t>
+      </w:r>
+      <w:proofErr w:type="gramEnd"/>
+      <w:r>
+        <w:rPr>
+          <w:rFonts w:ascii="Times New Roman" w:hAnsi="Times New Roman" w:cs="Times New Roman"/>
+          <w:i/>
+          <w:iCs/>
+        </w:rPr>
+        <w:t>.</w:t>
       </w:r>
     </w:p>
     <w:p>
@@ -876,6 +922,8 @@
           <w:rFonts w:ascii="Times New Roman" w:hAnsi="Times New Roman" w:cs="Times New Roman"/>
           <w:b/>
           <w:bCs/>
+          <w:i/>
+          <w:iCs/>
         </w:rPr>
       </w:pPr>
       <w:r>
@@ -883,7 +931,8 @@
           <w:rFonts w:ascii="Times New Roman" w:hAnsi="Times New Roman" w:cs="Times New Roman"/>
           <w:b/>
           <w:bCs/>
-          <w:highlight w:val="cyan"/>
+          <w:i/>
+          <w:iCs/>
         </w:rPr>
         <w:t>Formatting Guidelines</w:t>
       </w:r>
@@ -892,7 +941,8 @@
           <w:rFonts w:ascii="Times New Roman" w:hAnsi="Times New Roman" w:cs="Times New Roman"/>
           <w:b/>
           <w:bCs/>
-          <w:highlight w:val="cyan"/>
+          <w:i/>
+          <w:iCs/>
         </w:rPr>
         <w:t xml:space="preserve"> [Remove this in the final submission]</w:t>
       </w:r>
@@ -1002,6 +1052,8 @@
           <w:rFonts w:ascii="Times New Roman" w:hAnsi="Times New Roman" w:cs="Times New Roman"/>
           <w:b/>
           <w:bCs/>
+          <w:i/>
+          <w:iCs/>
         </w:rPr>
       </w:pPr>
       <w:r>
@@ -1009,7 +1061,8 @@
           <w:rFonts w:ascii="Times New Roman" w:hAnsi="Times New Roman" w:cs="Times New Roman"/>
           <w:b/>
           <w:bCs/>
-          <w:highlight w:val="cyan"/>
+          <w:i/>
+          <w:iCs/>
         </w:rPr>
         <w:t>Checklist Before Submitting</w:t>
       </w:r>
@@ -1018,7 +1071,8 @@
           <w:rFonts w:ascii="Times New Roman" w:hAnsi="Times New Roman" w:cs="Times New Roman"/>
           <w:b/>
           <w:bCs/>
-          <w:highlight w:val="cyan"/>
+          <w:i/>
+          <w:iCs/>
         </w:rPr>
         <w:t xml:space="preserve"> [Remove this in the final submission]</w:t>
       </w:r>
@@ -2527,6 +2581,7 @@
   <w:style w:type="character" w:default="1" w:styleId="DefaultParagraphFont">
     <w:name w:val="Default Paragraph Font"/>
     <w:uiPriority w:val="1"/>
+    <w:semiHidden/>
     <w:unhideWhenUsed/>
   </w:style>
   <w:style w:type="table" w:default="1" w:styleId="TableNormal">

</xml_diff>